<commit_message>
Revised skills for resume tailoring
</commit_message>
<xml_diff>
--- a/templates/template_0.docx
+++ b/templates/template_0.docx
@@ -38,15 +38,6 @@
       </w:pPr>
       <w:r>
         <w:rPr>
-          <w:rFonts w:asciiTheme="majorHAnsi" w:eastAsia="STIX Two Text" w:hAnsiTheme="majorHAnsi" w:cstheme="majorHAnsi"/>
-          <w:sz w:val="30"/>
-          <w:szCs w:val="30"/>
-          <w:highlight w:val="white"/>
-        </w:rPr>
-        <w:t>Role Title</w:t>
-      </w:r>
-      <w:r>
-        <w:rPr>
           <w:rFonts w:asciiTheme="majorHAnsi" w:hAnsiTheme="majorHAnsi" w:cstheme="majorHAnsi"/>
         </w:rPr>
         <w:pict w14:anchorId="30A918AE">
@@ -196,82 +187,44 @@
         </w:pBdr>
         <w:spacing w:line="240" w:lineRule="auto"/>
         <w:rPr>
-          <w:rFonts w:asciiTheme="majorHAnsi" w:eastAsia="STIX Two Text" w:hAnsiTheme="majorHAnsi" w:cstheme="majorHAnsi"/>
-          <w:b/>
-          <w:bCs/>
-          <w:sz w:val="24"/>
-          <w:szCs w:val="24"/>
-          <w:highlight w:val="white"/>
-        </w:rPr>
-      </w:pPr>
-      <w:r>
-        <w:rPr>
-          <w:rFonts w:asciiTheme="majorHAnsi" w:eastAsia="STIX Two Text" w:hAnsiTheme="majorHAnsi" w:cstheme="majorHAnsi"/>
-          <w:b/>
-          <w:bCs/>
-          <w:sz w:val="24"/>
-          <w:szCs w:val="24"/>
-          <w:highlight w:val="white"/>
-        </w:rPr>
-        <w:t xml:space="preserve">AREAS OF EXPERTISE                                                                                                                                                  </w:t>
-      </w:r>
-      <w:proofErr w:type="gramStart"/>
-      <w:r>
-        <w:rPr>
-          <w:rFonts w:asciiTheme="majorHAnsi" w:eastAsia="STIX Two Text" w:hAnsiTheme="majorHAnsi" w:cstheme="majorHAnsi"/>
-          <w:b/>
-          <w:bCs/>
-          <w:sz w:val="24"/>
-          <w:szCs w:val="24"/>
-          <w:highlight w:val="white"/>
-        </w:rPr>
-        <w:t xml:space="preserve">  </w:t>
-      </w:r>
-      <w:r>
-        <w:rPr>
-          <w:rFonts w:asciiTheme="majorHAnsi" w:eastAsia="STIX Two Text" w:hAnsiTheme="majorHAnsi" w:cstheme="majorHAnsi"/>
-          <w:b/>
-          <w:bCs/>
-          <w:color w:val="FFFFFF"/>
-          <w:sz w:val="24"/>
-          <w:szCs w:val="24"/>
-          <w:highlight w:val="white"/>
-        </w:rPr>
-        <w:t>.</w:t>
-      </w:r>
-      <w:proofErr w:type="gramEnd"/>
-      <w:r>
-        <w:rPr>
-          <w:rFonts w:asciiTheme="majorHAnsi" w:eastAsia="STIX Two Text" w:hAnsiTheme="majorHAnsi" w:cstheme="majorHAnsi"/>
-          <w:b/>
-          <w:bCs/>
-          <w:color w:val="FFFFFF"/>
-          <w:sz w:val="24"/>
-          <w:szCs w:val="24"/>
-          <w:highlight w:val="white"/>
-        </w:rPr>
-        <w:t xml:space="preserve"> </w:t>
-      </w:r>
-    </w:p>
-    <w:p>
-      <w:pPr>
-        <w:spacing w:line="240" w:lineRule="auto"/>
-        <w:rPr>
           <w:rFonts w:asciiTheme="majorHAnsi" w:eastAsia="Garamond" w:hAnsiTheme="majorHAnsi" w:cstheme="majorHAnsi"/>
           <w:sz w:val="12"/>
           <w:szCs w:val="12"/>
           <w:highlight w:val="white"/>
         </w:rPr>
         <w:sectPr>
-          <w:headerReference w:type="default" r:id="rId7"/>
-          <w:headerReference w:type="first" r:id="rId8"/>
-          <w:footerReference w:type="first" r:id="rId9"/>
+          <w:headerReference w:type="default" r:id="rId8"/>
+          <w:headerReference w:type="first" r:id="rId9"/>
+          <w:footerReference w:type="first" r:id="rId10"/>
           <w:type w:val="continuous"/>
           <w:pgSz w:w="12240" w:h="15840"/>
-          <w:pgMar w:top="578" w:right="578" w:bottom="578" w:left="578" w:header="142" w:footer="289" w:gutter="0"/>
+          <w:pgMar w:top="720" w:right="567" w:bottom="720" w:left="567" w:header="142" w:footer="289" w:gutter="0"/>
           <w:cols w:space="720"/>
+          <w:docGrid w:linePitch="299"/>
         </w:sectPr>
       </w:pPr>
+      <w:r>
+        <w:rPr>
+          <w:rFonts w:asciiTheme="majorHAnsi" w:eastAsia="STIX Two Text" w:hAnsiTheme="majorHAnsi" w:cstheme="majorHAnsi"/>
+          <w:b/>
+          <w:bCs/>
+          <w:sz w:val="24"/>
+          <w:szCs w:val="24"/>
+          <w:highlight w:val="white"/>
+        </w:rPr>
+        <w:t>AREAS OF EXPERTISE</w:t>
+      </w:r>
+      <w:r>
+        <w:rPr>
+          <w:rFonts w:asciiTheme="majorHAnsi" w:eastAsia="STIX Two Text" w:hAnsiTheme="majorHAnsi" w:cstheme="majorHAnsi"/>
+          <w:b/>
+          <w:bCs/>
+          <w:sz w:val="24"/>
+          <w:szCs w:val="24"/>
+          <w:highlight w:val="white"/>
+        </w:rPr>
+        <w:t xml:space="preserve"> </w:t>
+      </w:r>
     </w:p>
     <w:p>
       <w:pPr>
@@ -471,11 +424,11 @@
         <w:sectPr>
           <w:type w:val="continuous"/>
           <w:pgSz w:w="12240" w:h="15840"/>
-          <w:pgMar w:top="1008" w:right="1080" w:bottom="1008" w:left="1080" w:header="720" w:footer="720" w:gutter="0"/>
+          <w:pgMar w:top="1009" w:right="567" w:bottom="1009" w:left="567" w:header="720" w:footer="720" w:gutter="0"/>
           <w:cols w:num="3" w:space="720" w:equalWidth="0">
+            <w:col w:w="3393" w:space="720"/>
             <w:col w:w="2880" w:space="720"/>
-            <w:col w:w="2880" w:space="720"/>
-            <w:col w:w="2880" w:space="0"/>
+            <w:col w:w="3393" w:space="0"/>
           </w:cols>
         </w:sectPr>
       </w:pPr>
@@ -506,11 +459,22 @@
           <w:rFonts w:asciiTheme="majorHAnsi" w:eastAsia="STIX Two Text" w:hAnsiTheme="majorHAnsi" w:cstheme="majorHAnsi"/>
           <w:b/>
           <w:bCs/>
+          <w:sz w:val="4"/>
+          <w:szCs w:val="4"/>
+          <w:highlight w:val="white"/>
+        </w:rPr>
+      </w:pPr>
+      <w:r>
+        <w:rPr>
+          <w:rFonts w:asciiTheme="majorHAnsi" w:eastAsia="STIX Two Text" w:hAnsiTheme="majorHAnsi" w:cstheme="majorHAnsi"/>
+          <w:b/>
+          <w:bCs/>
           <w:sz w:val="24"/>
           <w:szCs w:val="24"/>
           <w:highlight w:val="white"/>
         </w:rPr>
-      </w:pPr>
+        <w:t>KEY ACHIEVEMENTS</w:t>
+      </w:r>
       <w:r>
         <w:rPr>
           <w:rFonts w:asciiTheme="majorHAnsi" w:eastAsia="STIX Two Text" w:hAnsiTheme="majorHAnsi" w:cstheme="majorHAnsi"/>
@@ -520,55 +484,7 @@
           <w:szCs w:val="24"/>
           <w:highlight w:val="white"/>
         </w:rPr>
-        <w:t xml:space="preserve">KEY ACHIEVEMENTS                                                                                                                                                   </w:t>
-      </w:r>
-      <w:proofErr w:type="gramStart"/>
-      <w:r>
-        <w:rPr>
-          <w:rFonts w:asciiTheme="majorHAnsi" w:eastAsia="STIX Two Text" w:hAnsiTheme="majorHAnsi" w:cstheme="majorHAnsi"/>
-          <w:b/>
-          <w:bCs/>
-          <w:sz w:val="24"/>
-          <w:szCs w:val="24"/>
-          <w:highlight w:val="white"/>
-        </w:rPr>
-        <w:t xml:space="preserve">  </w:t>
-      </w:r>
-      <w:r>
-        <w:rPr>
-          <w:rFonts w:asciiTheme="majorHAnsi" w:eastAsia="STIX Two Text" w:hAnsiTheme="majorHAnsi" w:cstheme="majorHAnsi"/>
-          <w:b/>
-          <w:bCs/>
-          <w:color w:val="FFFFFF"/>
-          <w:sz w:val="24"/>
-          <w:szCs w:val="24"/>
-          <w:highlight w:val="white"/>
-        </w:rPr>
-        <w:t>.</w:t>
-      </w:r>
-      <w:proofErr w:type="gramEnd"/>
-      <w:r>
-        <w:rPr>
-          <w:rFonts w:asciiTheme="majorHAnsi" w:eastAsia="STIX Two Text" w:hAnsiTheme="majorHAnsi" w:cstheme="majorHAnsi"/>
-          <w:b/>
-          <w:bCs/>
-          <w:color w:val="FFFFFF"/>
-          <w:sz w:val="24"/>
-          <w:szCs w:val="24"/>
-          <w:highlight w:val="white"/>
-        </w:rPr>
-        <w:t xml:space="preserve">  </w:t>
-      </w:r>
-      <w:r>
-        <w:rPr>
-          <w:rFonts w:asciiTheme="majorHAnsi" w:eastAsia="STIX Two Text" w:hAnsiTheme="majorHAnsi" w:cstheme="majorHAnsi"/>
-          <w:b/>
-          <w:bCs/>
-          <w:sz w:val="24"/>
-          <w:szCs w:val="24"/>
-          <w:highlight w:val="white"/>
-        </w:rPr>
-        <w:t xml:space="preserve">   </w:t>
+        <w:t xml:space="preserve"> </w:t>
       </w:r>
     </w:p>
     <w:p>
@@ -578,8 +494,6 @@
           <w:rFonts w:asciiTheme="majorHAnsi" w:eastAsia="STIX Two Text" w:hAnsiTheme="majorHAnsi" w:cstheme="majorHAnsi"/>
           <w:b/>
           <w:bCs/>
-          <w:sz w:val="4"/>
-          <w:szCs w:val="4"/>
           <w:highlight w:val="white"/>
         </w:rPr>
       </w:pPr>
@@ -729,19 +643,7 @@
           <w:szCs w:val="24"/>
           <w:highlight w:val="white"/>
         </w:rPr>
-        <w:t xml:space="preserve">PROFESSIONAL EXPERIENCE                                                                                               </w:t>
-      </w:r>
-      <w:r>
-        <w:rPr>
-          <w:rFonts w:asciiTheme="majorHAnsi" w:eastAsia="STIX Two Text" w:hAnsiTheme="majorHAnsi" w:cstheme="majorHAnsi"/>
-          <w:b/>
-          <w:bCs/>
-          <w:color w:val="FFFFFF"/>
-          <w:sz w:val="24"/>
-          <w:szCs w:val="24"/>
-          <w:highlight w:val="white"/>
-        </w:rPr>
-        <w:t>--</w:t>
+        <w:t>PROFESSIONAL EXPERIENCE</w:t>
       </w:r>
     </w:p>
     <w:p>
@@ -751,19 +653,6 @@
           <w:rFonts w:asciiTheme="majorHAnsi" w:eastAsia="STIX Two Text" w:hAnsiTheme="majorHAnsi" w:cstheme="majorHAnsi"/>
           <w:b/>
           <w:bCs/>
-          <w:sz w:val="4"/>
-          <w:szCs w:val="4"/>
-          <w:highlight w:val="white"/>
-        </w:rPr>
-      </w:pPr>
-    </w:p>
-    <w:p>
-      <w:pPr>
-        <w:spacing w:line="240" w:lineRule="auto"/>
-        <w:rPr>
-          <w:rFonts w:asciiTheme="majorHAnsi" w:eastAsia="STIX Two Text" w:hAnsiTheme="majorHAnsi" w:cstheme="majorHAnsi"/>
-          <w:b/>
-          <w:bCs/>
         </w:rPr>
       </w:pPr>
       <w:r>
@@ -861,7 +750,23 @@
           <w:b/>
           <w:bCs/>
         </w:rPr>
-        <w:t xml:space="preserve">               City, Country </w:t>
+        <w:t xml:space="preserve">               </w:t>
+      </w:r>
+      <w:r>
+        <w:rPr>
+          <w:rFonts w:asciiTheme="majorHAnsi" w:eastAsia="STIX Two Text" w:hAnsiTheme="majorHAnsi" w:cstheme="majorHAnsi"/>
+          <w:b/>
+          <w:bCs/>
+        </w:rPr>
+        <w:t xml:space="preserve"> </w:t>
+      </w:r>
+      <w:r>
+        <w:rPr>
+          <w:rFonts w:asciiTheme="majorHAnsi" w:eastAsia="STIX Two Text" w:hAnsiTheme="majorHAnsi" w:cstheme="majorHAnsi"/>
+          <w:b/>
+          <w:bCs/>
+        </w:rPr>
+        <w:t>City, Country</w:t>
       </w:r>
     </w:p>
     <w:p>
@@ -879,7 +784,19 @@
         <w:rPr>
           <w:rFonts w:asciiTheme="majorHAnsi" w:eastAsia="STIX Two Text" w:hAnsiTheme="majorHAnsi" w:cstheme="majorHAnsi"/>
         </w:rPr>
-        <w:t xml:space="preserve">Job Title              </w:t>
+        <w:t xml:space="preserve">Job Title </w:t>
+      </w:r>
+      <w:r>
+        <w:rPr>
+          <w:rFonts w:asciiTheme="majorHAnsi" w:eastAsia="STIX Two Text" w:hAnsiTheme="majorHAnsi" w:cstheme="majorHAnsi"/>
+        </w:rPr>
+        <w:t>2</w:t>
+      </w:r>
+      <w:r>
+        <w:rPr>
+          <w:rFonts w:asciiTheme="majorHAnsi" w:eastAsia="STIX Two Text" w:hAnsiTheme="majorHAnsi" w:cstheme="majorHAnsi"/>
+        </w:rPr>
+        <w:t xml:space="preserve">          </w:t>
       </w:r>
       <w:r>
         <w:rPr>
@@ -929,6 +846,12 @@
           <w:rFonts w:asciiTheme="majorHAnsi" w:eastAsia="STIX Two Text" w:hAnsiTheme="majorHAnsi" w:cstheme="majorHAnsi"/>
         </w:rPr>
         <w:t xml:space="preserve">                 </w:t>
+      </w:r>
+      <w:r>
+        <w:rPr>
+          <w:rFonts w:asciiTheme="majorHAnsi" w:eastAsia="STIX Two Text" w:hAnsiTheme="majorHAnsi" w:cstheme="majorHAnsi"/>
+        </w:rPr>
+        <w:t xml:space="preserve"> </w:t>
       </w:r>
       <w:r>
         <w:rPr>
@@ -938,30 +861,6 @@
         </w:rPr>
         <w:t>Month year–Month, year</w:t>
       </w:r>
-      <w:r>
-        <w:rPr>
-          <w:rFonts w:asciiTheme="majorHAnsi" w:eastAsia="STIX Two Text" w:hAnsiTheme="majorHAnsi" w:cstheme="majorHAnsi"/>
-          <w:b/>
-          <w:bCs/>
-          <w:i/>
-          <w:iCs/>
-        </w:rPr>
-        <w:t xml:space="preserve"> </w:t>
-      </w:r>
-    </w:p>
-    <w:p>
-      <w:pPr>
-        <w:spacing w:line="240" w:lineRule="auto"/>
-        <w:rPr>
-          <w:rFonts w:asciiTheme="majorHAnsi" w:eastAsia="STIX Two Text" w:hAnsiTheme="majorHAnsi" w:cstheme="majorHAnsi"/>
-          <w:b/>
-          <w:bCs/>
-          <w:i/>
-          <w:iCs/>
-          <w:sz w:val="6"/>
-          <w:szCs w:val="6"/>
-        </w:rPr>
-      </w:pPr>
     </w:p>
     <w:p>
       <w:pPr>
@@ -970,7 +869,7 @@
           <w:numId w:val="5"/>
         </w:numPr>
         <w:spacing w:after="60" w:line="240" w:lineRule="auto"/>
-        <w:ind w:left="641" w:right="851" w:hanging="357"/>
+        <w:ind w:left="641" w:hanging="357"/>
         <w:rPr>
           <w:rFonts w:asciiTheme="majorHAnsi" w:eastAsia="STIX Two Text" w:hAnsiTheme="majorHAnsi" w:cstheme="majorHAnsi"/>
           <w:i/>
@@ -1019,7 +918,7 @@
           <w:numId w:val="5"/>
         </w:numPr>
         <w:spacing w:after="60" w:line="240" w:lineRule="auto"/>
-        <w:ind w:left="641" w:right="851" w:hanging="357"/>
+        <w:ind w:left="641" w:hanging="357"/>
         <w:rPr>
           <w:rFonts w:asciiTheme="majorHAnsi" w:eastAsia="STIX Two Text" w:hAnsiTheme="majorHAnsi" w:cstheme="majorHAnsi"/>
         </w:rPr>
@@ -1029,124 +928,6 @@
           <w:rFonts w:asciiTheme="majorHAnsi" w:eastAsia="STIX Two Text" w:hAnsiTheme="majorHAnsi" w:cstheme="majorHAnsi"/>
         </w:rPr>
         <w:t>Add around 4 bullet points per role</w:t>
-      </w:r>
-    </w:p>
-    <w:p>
-      <w:pPr>
-        <w:spacing w:after="60" w:line="240" w:lineRule="auto"/>
-        <w:ind w:right="851"/>
-        <w:rPr>
-          <w:rFonts w:asciiTheme="majorHAnsi" w:eastAsia="STIX Two Text" w:hAnsiTheme="majorHAnsi" w:cstheme="majorHAnsi"/>
-          <w:sz w:val="6"/>
-          <w:szCs w:val="6"/>
-        </w:rPr>
-      </w:pPr>
-    </w:p>
-    <w:p>
-      <w:pPr>
-        <w:spacing w:line="240" w:lineRule="auto"/>
-        <w:rPr>
-          <w:rFonts w:asciiTheme="majorHAnsi" w:eastAsia="STIX Two Text" w:hAnsiTheme="majorHAnsi" w:cstheme="majorHAnsi"/>
-          <w:b/>
-          <w:bCs/>
-        </w:rPr>
-      </w:pPr>
-      <w:r>
-        <w:rPr>
-          <w:rFonts w:asciiTheme="majorHAnsi" w:eastAsia="STIX Two Text" w:hAnsiTheme="majorHAnsi" w:cstheme="majorHAnsi"/>
-          <w:b/>
-          <w:bCs/>
-        </w:rPr>
-        <w:t xml:space="preserve">COMPANY NAME </w:t>
-      </w:r>
-      <w:r>
-        <w:rPr>
-          <w:rFonts w:asciiTheme="majorHAnsi" w:eastAsia="STIX Two Text" w:hAnsiTheme="majorHAnsi" w:cstheme="majorHAnsi"/>
-          <w:b/>
-          <w:bCs/>
-        </w:rPr>
-        <w:tab/>
-      </w:r>
-      <w:r>
-        <w:rPr>
-          <w:rFonts w:asciiTheme="majorHAnsi" w:eastAsia="STIX Two Text" w:hAnsiTheme="majorHAnsi" w:cstheme="majorHAnsi"/>
-          <w:b/>
-          <w:bCs/>
-        </w:rPr>
-        <w:tab/>
-      </w:r>
-      <w:r>
-        <w:rPr>
-          <w:rFonts w:asciiTheme="majorHAnsi" w:eastAsia="STIX Two Text" w:hAnsiTheme="majorHAnsi" w:cstheme="majorHAnsi"/>
-          <w:b/>
-          <w:bCs/>
-        </w:rPr>
-        <w:tab/>
-      </w:r>
-      <w:r>
-        <w:rPr>
-          <w:rFonts w:asciiTheme="majorHAnsi" w:eastAsia="STIX Two Text" w:hAnsiTheme="majorHAnsi" w:cstheme="majorHAnsi"/>
-          <w:b/>
-          <w:bCs/>
-        </w:rPr>
-        <w:tab/>
-      </w:r>
-      <w:r>
-        <w:rPr>
-          <w:rFonts w:asciiTheme="majorHAnsi" w:eastAsia="STIX Two Text" w:hAnsiTheme="majorHAnsi" w:cstheme="majorHAnsi"/>
-          <w:b/>
-          <w:bCs/>
-        </w:rPr>
-        <w:tab/>
-      </w:r>
-      <w:r>
-        <w:rPr>
-          <w:rFonts w:asciiTheme="majorHAnsi" w:eastAsia="STIX Two Text" w:hAnsiTheme="majorHAnsi" w:cstheme="majorHAnsi"/>
-          <w:b/>
-          <w:bCs/>
-        </w:rPr>
-        <w:tab/>
-      </w:r>
-      <w:r>
-        <w:rPr>
-          <w:rFonts w:asciiTheme="majorHAnsi" w:eastAsia="STIX Two Text" w:hAnsiTheme="majorHAnsi" w:cstheme="majorHAnsi"/>
-          <w:b/>
-          <w:bCs/>
-        </w:rPr>
-        <w:tab/>
-      </w:r>
-      <w:r>
-        <w:rPr>
-          <w:rFonts w:asciiTheme="majorHAnsi" w:eastAsia="STIX Two Text" w:hAnsiTheme="majorHAnsi" w:cstheme="majorHAnsi"/>
-          <w:b/>
-          <w:bCs/>
-        </w:rPr>
-        <w:tab/>
-      </w:r>
-      <w:r>
-        <w:rPr>
-          <w:rFonts w:asciiTheme="majorHAnsi" w:eastAsia="STIX Two Text" w:hAnsiTheme="majorHAnsi" w:cstheme="majorHAnsi"/>
-          <w:b/>
-          <w:bCs/>
-        </w:rPr>
-        <w:tab/>
-        <w:t xml:space="preserve">                  </w:t>
-      </w:r>
-      <w:r>
-        <w:rPr>
-          <w:rFonts w:asciiTheme="majorHAnsi" w:eastAsia="STIX Two Text" w:hAnsiTheme="majorHAnsi" w:cstheme="majorHAnsi"/>
-          <w:b/>
-          <w:bCs/>
-        </w:rPr>
-        <w:t xml:space="preserve">      </w:t>
-      </w:r>
-      <w:r>
-        <w:rPr>
-          <w:rFonts w:asciiTheme="majorHAnsi" w:eastAsia="STIX Two Text" w:hAnsiTheme="majorHAnsi" w:cstheme="majorHAnsi"/>
-          <w:b/>
-          <w:bCs/>
-        </w:rPr>
-        <w:t xml:space="preserve">               City, Country </w:t>
       </w:r>
     </w:p>
     <w:p>
@@ -1164,7 +945,27 @@
         <w:rPr>
           <w:rFonts w:asciiTheme="majorHAnsi" w:eastAsia="STIX Two Text" w:hAnsiTheme="majorHAnsi" w:cstheme="majorHAnsi"/>
         </w:rPr>
-        <w:t xml:space="preserve">Job Title              </w:t>
+        <w:t xml:space="preserve">Job </w:t>
+      </w:r>
+      <w:proofErr w:type="gramStart"/>
+      <w:r>
+        <w:rPr>
+          <w:rFonts w:asciiTheme="majorHAnsi" w:eastAsia="STIX Two Text" w:hAnsiTheme="majorHAnsi" w:cstheme="majorHAnsi"/>
+        </w:rPr>
+        <w:t xml:space="preserve">Title  </w:t>
+      </w:r>
+      <w:r>
+        <w:rPr>
+          <w:rFonts w:asciiTheme="majorHAnsi" w:eastAsia="STIX Two Text" w:hAnsiTheme="majorHAnsi" w:cstheme="majorHAnsi"/>
+        </w:rPr>
+        <w:t>1</w:t>
+      </w:r>
+      <w:proofErr w:type="gramEnd"/>
+      <w:r>
+        <w:rPr>
+          <w:rFonts w:asciiTheme="majorHAnsi" w:eastAsia="STIX Two Text" w:hAnsiTheme="majorHAnsi" w:cstheme="majorHAnsi"/>
+        </w:rPr>
+        <w:t xml:space="preserve">         </w:t>
       </w:r>
       <w:r>
         <w:rPr>
@@ -1214,6 +1015,12 @@
           <w:rFonts w:asciiTheme="majorHAnsi" w:eastAsia="STIX Two Text" w:hAnsiTheme="majorHAnsi" w:cstheme="majorHAnsi"/>
         </w:rPr>
         <w:t xml:space="preserve">                 </w:t>
+      </w:r>
+      <w:r>
+        <w:rPr>
+          <w:rFonts w:asciiTheme="majorHAnsi" w:eastAsia="STIX Two Text" w:hAnsiTheme="majorHAnsi" w:cstheme="majorHAnsi"/>
+        </w:rPr>
+        <w:t xml:space="preserve"> </w:t>
       </w:r>
       <w:r>
         <w:rPr>
@@ -1233,20 +1040,6 @@
         </w:rPr>
         <w:t xml:space="preserve"> </w:t>
       </w:r>
-    </w:p>
-    <w:p>
-      <w:pPr>
-        <w:spacing w:line="240" w:lineRule="auto"/>
-        <w:rPr>
-          <w:rFonts w:asciiTheme="majorHAnsi" w:eastAsia="STIX Two Text" w:hAnsiTheme="majorHAnsi" w:cstheme="majorHAnsi"/>
-          <w:b/>
-          <w:bCs/>
-          <w:i/>
-          <w:iCs/>
-          <w:sz w:val="6"/>
-          <w:szCs w:val="6"/>
-        </w:rPr>
-      </w:pPr>
     </w:p>
     <w:p>
       <w:pPr>
@@ -1255,7 +1048,7 @@
           <w:numId w:val="5"/>
         </w:numPr>
         <w:spacing w:after="60" w:line="240" w:lineRule="auto"/>
-        <w:ind w:left="641" w:right="851" w:hanging="357"/>
+        <w:ind w:left="641" w:hanging="357"/>
         <w:rPr>
           <w:rFonts w:asciiTheme="majorHAnsi" w:eastAsia="STIX Two Text" w:hAnsiTheme="majorHAnsi" w:cstheme="majorHAnsi"/>
           <w:i/>
@@ -1304,7 +1097,7 @@
           <w:numId w:val="5"/>
         </w:numPr>
         <w:spacing w:after="60" w:line="240" w:lineRule="auto"/>
-        <w:ind w:left="641" w:right="851" w:hanging="357"/>
+        <w:ind w:left="641" w:hanging="357"/>
         <w:rPr>
           <w:rFonts w:asciiTheme="majorHAnsi" w:eastAsia="STIX Two Text" w:hAnsiTheme="majorHAnsi" w:cstheme="majorHAnsi"/>
         </w:rPr>
@@ -1318,185 +1111,125 @@
     </w:p>
     <w:p>
       <w:pPr>
-        <w:spacing w:after="60" w:line="240" w:lineRule="auto"/>
-        <w:ind w:right="851"/>
-        <w:rPr>
-          <w:rFonts w:asciiTheme="majorHAnsi" w:eastAsia="STIX Two Text" w:hAnsiTheme="majorHAnsi" w:cstheme="majorHAnsi"/>
-        </w:rPr>
-      </w:pPr>
-    </w:p>
-    <w:p>
-      <w:pPr>
-        <w:pBdr>
-          <w:bottom w:val="single" w:sz="6" w:space="1" w:color="auto"/>
-        </w:pBdr>
         <w:spacing w:line="240" w:lineRule="auto"/>
         <w:rPr>
           <w:rFonts w:asciiTheme="majorHAnsi" w:eastAsia="STIX Two Text" w:hAnsiTheme="majorHAnsi" w:cstheme="majorHAnsi"/>
           <w:b/>
           <w:bCs/>
-          <w:color w:val="FFFFFF"/>
-          <w:sz w:val="24"/>
-          <w:szCs w:val="24"/>
-          <w:highlight w:val="white"/>
-          <w:u w:val="single"/>
-        </w:rPr>
-      </w:pPr>
-      <w:r>
-        <w:rPr>
-          <w:rFonts w:asciiTheme="majorHAnsi" w:eastAsia="STIX Two Text" w:hAnsiTheme="majorHAnsi" w:cstheme="majorHAnsi"/>
-          <w:b/>
-          <w:bCs/>
-          <w:sz w:val="24"/>
-          <w:szCs w:val="24"/>
-          <w:highlight w:val="white"/>
-        </w:rPr>
-        <w:t>PROJECTS</w:t>
-      </w:r>
-      <w:r>
-        <w:rPr>
-          <w:rFonts w:asciiTheme="majorHAnsi" w:eastAsia="STIX Two Text" w:hAnsiTheme="majorHAnsi" w:cstheme="majorHAnsi"/>
-          <w:b/>
-          <w:bCs/>
-          <w:color w:val="FFFFFF"/>
-          <w:sz w:val="24"/>
-          <w:szCs w:val="24"/>
-          <w:highlight w:val="white"/>
-          <w:u w:val="single"/>
-        </w:rPr>
-        <w:t xml:space="preserve">.  </w:t>
-      </w:r>
-      <w:r>
-        <w:rPr>
-          <w:rFonts w:asciiTheme="majorHAnsi" w:eastAsia="STIX Two Text" w:hAnsiTheme="majorHAnsi" w:cstheme="majorHAnsi"/>
-          <w:b/>
-          <w:bCs/>
-          <w:sz w:val="24"/>
-          <w:szCs w:val="24"/>
-          <w:highlight w:val="white"/>
-          <w:u w:val="single"/>
-        </w:rPr>
-        <w:t xml:space="preserve">   </w:t>
-      </w:r>
-    </w:p>
-    <w:p>
-      <w:pPr>
-        <w:spacing w:line="240" w:lineRule="auto"/>
-        <w:rPr>
-          <w:rFonts w:asciiTheme="majorHAnsi" w:eastAsia="STIX Two Text" w:hAnsiTheme="majorHAnsi" w:cstheme="majorHAnsi"/>
-          <w:b/>
-          <w:bCs/>
-          <w:sz w:val="4"/>
-          <w:szCs w:val="4"/>
-          <w:highlight w:val="white"/>
-        </w:rPr>
-      </w:pPr>
-    </w:p>
-    <w:p>
-      <w:pPr>
-        <w:spacing w:line="240" w:lineRule="auto"/>
-        <w:rPr>
-          <w:rFonts w:asciiTheme="majorHAnsi" w:eastAsia="STIX Two Text" w:hAnsiTheme="majorHAnsi" w:cstheme="majorHAnsi"/>
-          <w:b/>
-          <w:bCs/>
-        </w:rPr>
-      </w:pPr>
-      <w:r>
-        <w:rPr>
-          <w:rFonts w:asciiTheme="majorHAnsi" w:eastAsia="STIX Two Text" w:hAnsiTheme="majorHAnsi" w:cstheme="majorHAnsi"/>
-          <w:b/>
-          <w:bCs/>
-        </w:rPr>
-        <w:t xml:space="preserve">PROJECT NAME </w:t>
-      </w:r>
-      <w:r>
-        <w:rPr>
-          <w:rFonts w:asciiTheme="majorHAnsi" w:eastAsia="STIX Two Text" w:hAnsiTheme="majorHAnsi" w:cstheme="majorHAnsi"/>
-          <w:b/>
-          <w:bCs/>
-        </w:rPr>
-        <w:tab/>
-      </w:r>
-      <w:r>
-        <w:rPr>
-          <w:rFonts w:asciiTheme="majorHAnsi" w:eastAsia="STIX Two Text" w:hAnsiTheme="majorHAnsi" w:cstheme="majorHAnsi"/>
-          <w:b/>
-          <w:bCs/>
-        </w:rPr>
-        <w:tab/>
-      </w:r>
-      <w:r>
-        <w:rPr>
-          <w:rFonts w:asciiTheme="majorHAnsi" w:eastAsia="STIX Two Text" w:hAnsiTheme="majorHAnsi" w:cstheme="majorHAnsi"/>
-          <w:b/>
-          <w:bCs/>
-        </w:rPr>
-        <w:tab/>
-      </w:r>
-      <w:r>
-        <w:rPr>
-          <w:rFonts w:asciiTheme="majorHAnsi" w:eastAsia="STIX Two Text" w:hAnsiTheme="majorHAnsi" w:cstheme="majorHAnsi"/>
-          <w:b/>
-          <w:bCs/>
-        </w:rPr>
-        <w:tab/>
-      </w:r>
-      <w:r>
-        <w:rPr>
-          <w:rFonts w:asciiTheme="majorHAnsi" w:eastAsia="STIX Two Text" w:hAnsiTheme="majorHAnsi" w:cstheme="majorHAnsi"/>
-          <w:b/>
-          <w:bCs/>
-        </w:rPr>
-        <w:tab/>
-      </w:r>
-      <w:r>
-        <w:rPr>
-          <w:rFonts w:asciiTheme="majorHAnsi" w:eastAsia="STIX Two Text" w:hAnsiTheme="majorHAnsi" w:cstheme="majorHAnsi"/>
-          <w:b/>
-          <w:bCs/>
-        </w:rPr>
-        <w:tab/>
-      </w:r>
-      <w:r>
-        <w:rPr>
-          <w:rFonts w:asciiTheme="majorHAnsi" w:eastAsia="STIX Two Text" w:hAnsiTheme="majorHAnsi" w:cstheme="majorHAnsi"/>
-          <w:b/>
-          <w:bCs/>
-        </w:rPr>
-        <w:tab/>
-      </w:r>
-      <w:r>
-        <w:rPr>
-          <w:rFonts w:asciiTheme="majorHAnsi" w:eastAsia="STIX Two Text" w:hAnsiTheme="majorHAnsi" w:cstheme="majorHAnsi"/>
-          <w:b/>
-          <w:bCs/>
-        </w:rPr>
-        <w:tab/>
-      </w:r>
-      <w:r>
-        <w:rPr>
-          <w:rFonts w:asciiTheme="majorHAnsi" w:eastAsia="STIX Two Text" w:hAnsiTheme="majorHAnsi" w:cstheme="majorHAnsi"/>
-          <w:b/>
-          <w:bCs/>
-        </w:rPr>
-        <w:tab/>
-        <w:t xml:space="preserve">                     </w:t>
-      </w:r>
-      <w:r>
-        <w:rPr>
-          <w:rFonts w:asciiTheme="majorHAnsi" w:eastAsia="STIX Two Text" w:hAnsiTheme="majorHAnsi" w:cstheme="majorHAnsi"/>
-          <w:b/>
-          <w:bCs/>
-        </w:rPr>
-        <w:t xml:space="preserve">       </w:t>
-      </w:r>
-      <w:r>
-        <w:rPr>
-          <w:rFonts w:asciiTheme="majorHAnsi" w:eastAsia="STIX Two Text" w:hAnsiTheme="majorHAnsi" w:cstheme="majorHAnsi"/>
-          <w:b/>
-          <w:bCs/>
-        </w:rPr>
-        <w:t xml:space="preserve">Where + Hyperlink </w:t>
+        </w:rPr>
+      </w:pPr>
+      <w:r>
+        <w:rPr>
+          <w:rFonts w:asciiTheme="majorHAnsi" w:eastAsia="STIX Two Text" w:hAnsiTheme="majorHAnsi" w:cstheme="majorHAnsi"/>
+          <w:b/>
+          <w:bCs/>
+        </w:rPr>
+        <w:t xml:space="preserve">COMPANY NAME </w:t>
+      </w:r>
+      <w:r>
+        <w:rPr>
+          <w:rFonts w:asciiTheme="majorHAnsi" w:eastAsia="STIX Two Text" w:hAnsiTheme="majorHAnsi" w:cstheme="majorHAnsi"/>
+          <w:b/>
+          <w:bCs/>
+        </w:rPr>
+        <w:tab/>
+      </w:r>
+      <w:r>
+        <w:rPr>
+          <w:rFonts w:asciiTheme="majorHAnsi" w:eastAsia="STIX Two Text" w:hAnsiTheme="majorHAnsi" w:cstheme="majorHAnsi"/>
+          <w:b/>
+          <w:bCs/>
+        </w:rPr>
+        <w:tab/>
+      </w:r>
+      <w:r>
+        <w:rPr>
+          <w:rFonts w:asciiTheme="majorHAnsi" w:eastAsia="STIX Two Text" w:hAnsiTheme="majorHAnsi" w:cstheme="majorHAnsi"/>
+          <w:b/>
+          <w:bCs/>
+        </w:rPr>
+        <w:tab/>
+      </w:r>
+      <w:r>
+        <w:rPr>
+          <w:rFonts w:asciiTheme="majorHAnsi" w:eastAsia="STIX Two Text" w:hAnsiTheme="majorHAnsi" w:cstheme="majorHAnsi"/>
+          <w:b/>
+          <w:bCs/>
+        </w:rPr>
+        <w:tab/>
+      </w:r>
+      <w:r>
+        <w:rPr>
+          <w:rFonts w:asciiTheme="majorHAnsi" w:eastAsia="STIX Two Text" w:hAnsiTheme="majorHAnsi" w:cstheme="majorHAnsi"/>
+          <w:b/>
+          <w:bCs/>
+        </w:rPr>
+        <w:tab/>
+      </w:r>
+      <w:r>
+        <w:rPr>
+          <w:rFonts w:asciiTheme="majorHAnsi" w:eastAsia="STIX Two Text" w:hAnsiTheme="majorHAnsi" w:cstheme="majorHAnsi"/>
+          <w:b/>
+          <w:bCs/>
+        </w:rPr>
+        <w:tab/>
+      </w:r>
+      <w:r>
+        <w:rPr>
+          <w:rFonts w:asciiTheme="majorHAnsi" w:eastAsia="STIX Two Text" w:hAnsiTheme="majorHAnsi" w:cstheme="majorHAnsi"/>
+          <w:b/>
+          <w:bCs/>
+        </w:rPr>
+        <w:tab/>
+      </w:r>
+      <w:r>
+        <w:rPr>
+          <w:rFonts w:asciiTheme="majorHAnsi" w:eastAsia="STIX Two Text" w:hAnsiTheme="majorHAnsi" w:cstheme="majorHAnsi"/>
+          <w:b/>
+          <w:bCs/>
+        </w:rPr>
+        <w:tab/>
+      </w:r>
+      <w:r>
+        <w:rPr>
+          <w:rFonts w:asciiTheme="majorHAnsi" w:eastAsia="STIX Two Text" w:hAnsiTheme="majorHAnsi" w:cstheme="majorHAnsi"/>
+          <w:b/>
+          <w:bCs/>
+        </w:rPr>
+        <w:tab/>
+        <w:t xml:space="preserve">                  </w:t>
+      </w:r>
+      <w:r>
+        <w:rPr>
+          <w:rFonts w:asciiTheme="majorHAnsi" w:eastAsia="STIX Two Text" w:hAnsiTheme="majorHAnsi" w:cstheme="majorHAnsi"/>
+          <w:b/>
+          <w:bCs/>
+        </w:rPr>
+        <w:t xml:space="preserve">      </w:t>
+      </w:r>
+      <w:r>
+        <w:rPr>
+          <w:rFonts w:asciiTheme="majorHAnsi" w:eastAsia="STIX Two Text" w:hAnsiTheme="majorHAnsi" w:cstheme="majorHAnsi"/>
+          <w:b/>
+          <w:bCs/>
+        </w:rPr>
+        <w:t xml:space="preserve">               </w:t>
+      </w:r>
+      <w:r>
+        <w:rPr>
+          <w:rFonts w:asciiTheme="majorHAnsi" w:eastAsia="STIX Two Text" w:hAnsiTheme="majorHAnsi" w:cstheme="majorHAnsi"/>
+          <w:b/>
+          <w:bCs/>
+        </w:rPr>
+        <w:t xml:space="preserve"> </w:t>
+      </w:r>
+      <w:r>
+        <w:rPr>
+          <w:rFonts w:asciiTheme="majorHAnsi" w:eastAsia="STIX Two Text" w:hAnsiTheme="majorHAnsi" w:cstheme="majorHAnsi"/>
+          <w:b/>
+          <w:bCs/>
+        </w:rPr>
+        <w:t xml:space="preserve">City, Country </w:t>
       </w:r>
     </w:p>
     <w:p>
@@ -1514,50 +1247,62 @@
         <w:rPr>
           <w:rFonts w:asciiTheme="majorHAnsi" w:eastAsia="STIX Two Text" w:hAnsiTheme="majorHAnsi" w:cstheme="majorHAnsi"/>
         </w:rPr>
-        <w:tab/>
-      </w:r>
-      <w:r>
-        <w:rPr>
-          <w:rFonts w:asciiTheme="majorHAnsi" w:eastAsia="STIX Two Text" w:hAnsiTheme="majorHAnsi" w:cstheme="majorHAnsi"/>
-        </w:rPr>
-        <w:tab/>
-      </w:r>
-      <w:r>
-        <w:rPr>
-          <w:rFonts w:asciiTheme="majorHAnsi" w:eastAsia="STIX Two Text" w:hAnsiTheme="majorHAnsi" w:cstheme="majorHAnsi"/>
-        </w:rPr>
-        <w:tab/>
-      </w:r>
-      <w:r>
-        <w:rPr>
-          <w:rFonts w:asciiTheme="majorHAnsi" w:eastAsia="STIX Two Text" w:hAnsiTheme="majorHAnsi" w:cstheme="majorHAnsi"/>
-        </w:rPr>
-        <w:tab/>
-      </w:r>
-      <w:r>
-        <w:rPr>
-          <w:rFonts w:asciiTheme="majorHAnsi" w:eastAsia="STIX Two Text" w:hAnsiTheme="majorHAnsi" w:cstheme="majorHAnsi"/>
-        </w:rPr>
-        <w:tab/>
-      </w:r>
-      <w:r>
-        <w:rPr>
-          <w:rFonts w:asciiTheme="majorHAnsi" w:eastAsia="STIX Two Text" w:hAnsiTheme="majorHAnsi" w:cstheme="majorHAnsi"/>
-        </w:rPr>
-        <w:tab/>
-      </w:r>
-      <w:r>
-        <w:rPr>
-          <w:rFonts w:asciiTheme="majorHAnsi" w:eastAsia="STIX Two Text" w:hAnsiTheme="majorHAnsi" w:cstheme="majorHAnsi"/>
-        </w:rPr>
-        <w:tab/>
-        <w:t xml:space="preserve">                                                                        </w:t>
-      </w:r>
-      <w:r>
-        <w:rPr>
-          <w:rFonts w:asciiTheme="majorHAnsi" w:eastAsia="STIX Two Text" w:hAnsiTheme="majorHAnsi" w:cstheme="majorHAnsi"/>
-        </w:rPr>
-        <w:t xml:space="preserve">   </w:t>
+        <w:t xml:space="preserve">Job Title              </w:t>
+      </w:r>
+      <w:r>
+        <w:rPr>
+          <w:rFonts w:asciiTheme="majorHAnsi" w:eastAsia="STIX Two Text" w:hAnsiTheme="majorHAnsi" w:cstheme="majorHAnsi"/>
+        </w:rPr>
+        <w:tab/>
+      </w:r>
+      <w:r>
+        <w:rPr>
+          <w:rFonts w:asciiTheme="majorHAnsi" w:eastAsia="STIX Two Text" w:hAnsiTheme="majorHAnsi" w:cstheme="majorHAnsi"/>
+        </w:rPr>
+        <w:tab/>
+      </w:r>
+      <w:r>
+        <w:rPr>
+          <w:rFonts w:asciiTheme="majorHAnsi" w:eastAsia="STIX Two Text" w:hAnsiTheme="majorHAnsi" w:cstheme="majorHAnsi"/>
+        </w:rPr>
+        <w:tab/>
+      </w:r>
+      <w:r>
+        <w:rPr>
+          <w:rFonts w:asciiTheme="majorHAnsi" w:eastAsia="STIX Two Text" w:hAnsiTheme="majorHAnsi" w:cstheme="majorHAnsi"/>
+        </w:rPr>
+        <w:tab/>
+      </w:r>
+      <w:r>
+        <w:rPr>
+          <w:rFonts w:asciiTheme="majorHAnsi" w:eastAsia="STIX Two Text" w:hAnsiTheme="majorHAnsi" w:cstheme="majorHAnsi"/>
+        </w:rPr>
+        <w:tab/>
+      </w:r>
+      <w:r>
+        <w:rPr>
+          <w:rFonts w:asciiTheme="majorHAnsi" w:eastAsia="STIX Two Text" w:hAnsiTheme="majorHAnsi" w:cstheme="majorHAnsi"/>
+        </w:rPr>
+        <w:tab/>
+      </w:r>
+      <w:r>
+        <w:rPr>
+          <w:rFonts w:asciiTheme="majorHAnsi" w:eastAsia="STIX Two Text" w:hAnsiTheme="majorHAnsi" w:cstheme="majorHAnsi"/>
+        </w:rPr>
+        <w:tab/>
+        <w:t xml:space="preserve">                                            </w:t>
+      </w:r>
+      <w:r>
+        <w:rPr>
+          <w:rFonts w:asciiTheme="majorHAnsi" w:eastAsia="STIX Two Text" w:hAnsiTheme="majorHAnsi" w:cstheme="majorHAnsi"/>
+        </w:rPr>
+        <w:t xml:space="preserve">                 </w:t>
+      </w:r>
+      <w:r>
+        <w:rPr>
+          <w:rFonts w:asciiTheme="majorHAnsi" w:eastAsia="STIX Two Text" w:hAnsiTheme="majorHAnsi" w:cstheme="majorHAnsi"/>
+        </w:rPr>
+        <w:t xml:space="preserve"> </w:t>
       </w:r>
       <w:r>
         <w:rPr>
@@ -1577,20 +1322,6 @@
         </w:rPr>
         <w:t xml:space="preserve"> </w:t>
       </w:r>
-    </w:p>
-    <w:p>
-      <w:pPr>
-        <w:spacing w:line="240" w:lineRule="auto"/>
-        <w:rPr>
-          <w:rFonts w:asciiTheme="majorHAnsi" w:eastAsia="STIX Two Text" w:hAnsiTheme="majorHAnsi" w:cstheme="majorHAnsi"/>
-          <w:b/>
-          <w:bCs/>
-          <w:i/>
-          <w:iCs/>
-          <w:sz w:val="6"/>
-          <w:szCs w:val="6"/>
-        </w:rPr>
-      </w:pPr>
     </w:p>
     <w:p>
       <w:pPr>
@@ -1599,7 +1330,7 @@
           <w:numId w:val="5"/>
         </w:numPr>
         <w:spacing w:after="60" w:line="240" w:lineRule="auto"/>
-        <w:ind w:left="641" w:right="851" w:hanging="357"/>
+        <w:ind w:left="641" w:hanging="357"/>
         <w:rPr>
           <w:rFonts w:asciiTheme="majorHAnsi" w:eastAsia="STIX Two Text" w:hAnsiTheme="majorHAnsi" w:cstheme="majorHAnsi"/>
           <w:i/>
@@ -1648,28 +1379,16 @@
           <w:numId w:val="5"/>
         </w:numPr>
         <w:spacing w:after="60" w:line="240" w:lineRule="auto"/>
-        <w:ind w:left="641" w:right="851" w:hanging="357"/>
-        <w:rPr>
-          <w:rFonts w:asciiTheme="majorHAnsi" w:eastAsia="STIX Two Text" w:hAnsiTheme="majorHAnsi" w:cstheme="majorHAnsi"/>
-        </w:rPr>
-      </w:pPr>
-      <w:r>
-        <w:rPr>
-          <w:rFonts w:asciiTheme="majorHAnsi" w:eastAsia="STIX Two Text" w:hAnsiTheme="majorHAnsi" w:cstheme="majorHAnsi"/>
-        </w:rPr>
-        <w:t xml:space="preserve">Add around </w:t>
-      </w:r>
-      <w:r>
-        <w:rPr>
-          <w:rFonts w:asciiTheme="majorHAnsi" w:eastAsia="STIX Two Text" w:hAnsiTheme="majorHAnsi" w:cstheme="majorHAnsi"/>
-        </w:rPr>
-        <w:t>2</w:t>
-      </w:r>
-      <w:r>
-        <w:rPr>
-          <w:rFonts w:asciiTheme="majorHAnsi" w:eastAsia="STIX Two Text" w:hAnsiTheme="majorHAnsi" w:cstheme="majorHAnsi"/>
-        </w:rPr>
-        <w:t xml:space="preserve"> bullet points per project</w:t>
+        <w:ind w:left="641" w:hanging="357"/>
+        <w:rPr>
+          <w:rFonts w:asciiTheme="majorHAnsi" w:eastAsia="STIX Two Text" w:hAnsiTheme="majorHAnsi" w:cstheme="majorHAnsi"/>
+        </w:rPr>
+      </w:pPr>
+      <w:r>
+        <w:rPr>
+          <w:rFonts w:asciiTheme="majorHAnsi" w:eastAsia="STIX Two Text" w:hAnsiTheme="majorHAnsi" w:cstheme="majorHAnsi"/>
+        </w:rPr>
+        <w:t>Add around 4 bullet points per role</w:t>
       </w:r>
     </w:p>
     <w:p>
@@ -1691,8 +1410,11 @@
           <w:rFonts w:asciiTheme="majorHAnsi" w:eastAsia="STIX Two Text" w:hAnsiTheme="majorHAnsi" w:cstheme="majorHAnsi"/>
           <w:b/>
           <w:bCs/>
+          <w:color w:val="FFFFFF"/>
           <w:sz w:val="24"/>
           <w:szCs w:val="24"/>
+          <w:highlight w:val="white"/>
+          <w:u w:val="single"/>
         </w:rPr>
       </w:pPr>
       <w:r>
@@ -1702,28 +1424,9 @@
           <w:bCs/>
           <w:sz w:val="24"/>
           <w:szCs w:val="24"/>
-        </w:rPr>
-        <w:t xml:space="preserve">EDUCATION </w:t>
-      </w:r>
-      <w:r>
-        <w:rPr>
-          <w:rFonts w:asciiTheme="majorHAnsi" w:eastAsia="STIX Two Text" w:hAnsiTheme="majorHAnsi" w:cstheme="majorHAnsi"/>
-          <w:b/>
-          <w:bCs/>
-          <w:sz w:val="24"/>
-          <w:szCs w:val="24"/>
-        </w:rPr>
-        <w:t>&amp; CERTIFICATIONS</w:t>
-      </w:r>
-      <w:r>
-        <w:rPr>
-          <w:rFonts w:asciiTheme="majorHAnsi" w:eastAsia="STIX Two Text" w:hAnsiTheme="majorHAnsi" w:cstheme="majorHAnsi"/>
-          <w:b/>
-          <w:bCs/>
-          <w:sz w:val="24"/>
-          <w:szCs w:val="24"/>
-        </w:rPr>
-        <w:t xml:space="preserve">                                                                                                                                                                       </w:t>
+          <w:highlight w:val="white"/>
+        </w:rPr>
+        <w:t>PROJECTS</w:t>
       </w:r>
     </w:p>
     <w:p>
@@ -1733,10 +1436,113 @@
           <w:rFonts w:asciiTheme="majorHAnsi" w:eastAsia="STIX Two Text" w:hAnsiTheme="majorHAnsi" w:cstheme="majorHAnsi"/>
           <w:b/>
           <w:bCs/>
-          <w:sz w:val="4"/>
-          <w:szCs w:val="4"/>
-        </w:rPr>
-      </w:pPr>
+        </w:rPr>
+      </w:pPr>
+      <w:r>
+        <w:rPr>
+          <w:rFonts w:asciiTheme="majorHAnsi" w:eastAsia="STIX Two Text" w:hAnsiTheme="majorHAnsi" w:cstheme="majorHAnsi"/>
+          <w:b/>
+          <w:bCs/>
+        </w:rPr>
+        <w:t xml:space="preserve">PROJECT NAME </w:t>
+      </w:r>
+      <w:r>
+        <w:rPr>
+          <w:rFonts w:asciiTheme="majorHAnsi" w:eastAsia="STIX Two Text" w:hAnsiTheme="majorHAnsi" w:cstheme="majorHAnsi"/>
+          <w:b/>
+          <w:bCs/>
+        </w:rPr>
+        <w:tab/>
+      </w:r>
+      <w:r>
+        <w:rPr>
+          <w:rFonts w:asciiTheme="majorHAnsi" w:eastAsia="STIX Two Text" w:hAnsiTheme="majorHAnsi" w:cstheme="majorHAnsi"/>
+          <w:b/>
+          <w:bCs/>
+        </w:rPr>
+        <w:tab/>
+      </w:r>
+      <w:r>
+        <w:rPr>
+          <w:rFonts w:asciiTheme="majorHAnsi" w:eastAsia="STIX Two Text" w:hAnsiTheme="majorHAnsi" w:cstheme="majorHAnsi"/>
+          <w:b/>
+          <w:bCs/>
+        </w:rPr>
+        <w:tab/>
+      </w:r>
+      <w:r>
+        <w:rPr>
+          <w:rFonts w:asciiTheme="majorHAnsi" w:eastAsia="STIX Two Text" w:hAnsiTheme="majorHAnsi" w:cstheme="majorHAnsi"/>
+          <w:b/>
+          <w:bCs/>
+        </w:rPr>
+        <w:tab/>
+      </w:r>
+      <w:r>
+        <w:rPr>
+          <w:rFonts w:asciiTheme="majorHAnsi" w:eastAsia="STIX Two Text" w:hAnsiTheme="majorHAnsi" w:cstheme="majorHAnsi"/>
+          <w:b/>
+          <w:bCs/>
+        </w:rPr>
+        <w:tab/>
+      </w:r>
+      <w:r>
+        <w:rPr>
+          <w:rFonts w:asciiTheme="majorHAnsi" w:eastAsia="STIX Two Text" w:hAnsiTheme="majorHAnsi" w:cstheme="majorHAnsi"/>
+          <w:b/>
+          <w:bCs/>
+        </w:rPr>
+        <w:tab/>
+      </w:r>
+      <w:r>
+        <w:rPr>
+          <w:rFonts w:asciiTheme="majorHAnsi" w:eastAsia="STIX Two Text" w:hAnsiTheme="majorHAnsi" w:cstheme="majorHAnsi"/>
+          <w:b/>
+          <w:bCs/>
+        </w:rPr>
+        <w:tab/>
+      </w:r>
+      <w:r>
+        <w:rPr>
+          <w:rFonts w:asciiTheme="majorHAnsi" w:eastAsia="STIX Two Text" w:hAnsiTheme="majorHAnsi" w:cstheme="majorHAnsi"/>
+          <w:b/>
+          <w:bCs/>
+        </w:rPr>
+        <w:tab/>
+      </w:r>
+      <w:r>
+        <w:rPr>
+          <w:rFonts w:asciiTheme="majorHAnsi" w:eastAsia="STIX Two Text" w:hAnsiTheme="majorHAnsi" w:cstheme="majorHAnsi"/>
+          <w:b/>
+          <w:bCs/>
+        </w:rPr>
+        <w:tab/>
+        <w:t xml:space="preserve">                     </w:t>
+      </w:r>
+      <w:r>
+        <w:rPr>
+          <w:rFonts w:asciiTheme="majorHAnsi" w:eastAsia="STIX Two Text" w:hAnsiTheme="majorHAnsi" w:cstheme="majorHAnsi"/>
+          <w:b/>
+          <w:bCs/>
+        </w:rPr>
+        <w:t xml:space="preserve">       </w:t>
+      </w:r>
+      <w:r>
+        <w:rPr>
+          <w:rFonts w:asciiTheme="majorHAnsi" w:eastAsia="STIX Two Text" w:hAnsiTheme="majorHAnsi" w:cstheme="majorHAnsi"/>
+          <w:b/>
+          <w:bCs/>
+        </w:rPr>
+        <w:t xml:space="preserve"> </w:t>
+      </w:r>
+      <w:r>
+        <w:rPr>
+          <w:rFonts w:asciiTheme="majorHAnsi" w:eastAsia="STIX Two Text" w:hAnsiTheme="majorHAnsi" w:cstheme="majorHAnsi"/>
+          <w:b/>
+          <w:bCs/>
+        </w:rPr>
+        <w:t xml:space="preserve">Where + Hyperlink </w:t>
+      </w:r>
     </w:p>
     <w:p>
       <w:pPr>
@@ -1745,72 +1551,186 @@
           <w:rFonts w:asciiTheme="majorHAnsi" w:eastAsia="STIX Two Text" w:hAnsiTheme="majorHAnsi" w:cstheme="majorHAnsi"/>
           <w:b/>
           <w:bCs/>
-        </w:rPr>
-      </w:pPr>
-      <w:r>
-        <w:rPr>
-          <w:rFonts w:asciiTheme="majorHAnsi" w:eastAsia="STIX Two Text" w:hAnsiTheme="majorHAnsi" w:cstheme="majorHAnsi"/>
-          <w:b/>
-          <w:bCs/>
-        </w:rPr>
-        <w:t xml:space="preserve">UNIVERSITY (OR LAST EDUCATION </w:t>
-      </w:r>
-      <w:proofErr w:type="gramStart"/>
-      <w:r>
-        <w:rPr>
-          <w:rFonts w:asciiTheme="majorHAnsi" w:eastAsia="STIX Two Text" w:hAnsiTheme="majorHAnsi" w:cstheme="majorHAnsi"/>
-          <w:b/>
-          <w:bCs/>
-        </w:rPr>
-        <w:t xml:space="preserve">PLACE)   </w:t>
-      </w:r>
-      <w:proofErr w:type="gramEnd"/>
-      <w:r>
-        <w:rPr>
-          <w:rFonts w:asciiTheme="majorHAnsi" w:eastAsia="STIX Two Text" w:hAnsiTheme="majorHAnsi" w:cstheme="majorHAnsi"/>
-          <w:b/>
-          <w:bCs/>
-        </w:rPr>
-        <w:t xml:space="preserve">                                                                          </w:t>
-      </w:r>
-      <w:r>
-        <w:rPr>
-          <w:rFonts w:asciiTheme="majorHAnsi" w:eastAsia="STIX Two Text" w:hAnsiTheme="majorHAnsi" w:cstheme="majorHAnsi"/>
-          <w:b/>
-          <w:bCs/>
-        </w:rPr>
-        <w:t xml:space="preserve">                       </w:t>
-      </w:r>
-      <w:r>
-        <w:rPr>
-          <w:rFonts w:asciiTheme="majorHAnsi" w:eastAsia="STIX Two Text" w:hAnsiTheme="majorHAnsi" w:cstheme="majorHAnsi"/>
           <w:i/>
           <w:iCs/>
         </w:rPr>
+      </w:pPr>
+      <w:r>
+        <w:rPr>
+          <w:rFonts w:asciiTheme="majorHAnsi" w:eastAsia="STIX Two Text" w:hAnsiTheme="majorHAnsi" w:cstheme="majorHAnsi"/>
+        </w:rPr>
+        <w:tab/>
+      </w:r>
+      <w:r>
+        <w:rPr>
+          <w:rFonts w:asciiTheme="majorHAnsi" w:eastAsia="STIX Two Text" w:hAnsiTheme="majorHAnsi" w:cstheme="majorHAnsi"/>
+        </w:rPr>
+        <w:tab/>
+      </w:r>
+      <w:r>
+        <w:rPr>
+          <w:rFonts w:asciiTheme="majorHAnsi" w:eastAsia="STIX Two Text" w:hAnsiTheme="majorHAnsi" w:cstheme="majorHAnsi"/>
+        </w:rPr>
+        <w:tab/>
+      </w:r>
+      <w:r>
+        <w:rPr>
+          <w:rFonts w:asciiTheme="majorHAnsi" w:eastAsia="STIX Two Text" w:hAnsiTheme="majorHAnsi" w:cstheme="majorHAnsi"/>
+        </w:rPr>
+        <w:tab/>
+      </w:r>
+      <w:r>
+        <w:rPr>
+          <w:rFonts w:asciiTheme="majorHAnsi" w:eastAsia="STIX Two Text" w:hAnsiTheme="majorHAnsi" w:cstheme="majorHAnsi"/>
+        </w:rPr>
+        <w:tab/>
+      </w:r>
+      <w:r>
+        <w:rPr>
+          <w:rFonts w:asciiTheme="majorHAnsi" w:eastAsia="STIX Two Text" w:hAnsiTheme="majorHAnsi" w:cstheme="majorHAnsi"/>
+        </w:rPr>
+        <w:tab/>
+      </w:r>
+      <w:r>
+        <w:rPr>
+          <w:rFonts w:asciiTheme="majorHAnsi" w:eastAsia="STIX Two Text" w:hAnsiTheme="majorHAnsi" w:cstheme="majorHAnsi"/>
+        </w:rPr>
+        <w:tab/>
+        <w:t xml:space="preserve">                                                                        </w:t>
+      </w:r>
+      <w:r>
+        <w:rPr>
+          <w:rFonts w:asciiTheme="majorHAnsi" w:eastAsia="STIX Two Text" w:hAnsiTheme="majorHAnsi" w:cstheme="majorHAnsi"/>
+        </w:rPr>
+        <w:t xml:space="preserve">   </w:t>
+      </w:r>
+      <w:r>
+        <w:rPr>
+          <w:rFonts w:asciiTheme="majorHAnsi" w:eastAsia="STIX Two Text" w:hAnsiTheme="majorHAnsi" w:cstheme="majorHAnsi"/>
+        </w:rPr>
+        <w:t xml:space="preserve"> </w:t>
+      </w:r>
+      <w:r>
+        <w:rPr>
+          <w:rFonts w:asciiTheme="majorHAnsi" w:eastAsia="STIX Two Text" w:hAnsiTheme="majorHAnsi" w:cstheme="majorHAnsi"/>
+          <w:i/>
+          <w:iCs/>
+        </w:rPr>
         <w:t>Month year–Month, year</w:t>
       </w:r>
+      <w:r>
+        <w:rPr>
+          <w:rFonts w:asciiTheme="majorHAnsi" w:eastAsia="STIX Two Text" w:hAnsiTheme="majorHAnsi" w:cstheme="majorHAnsi"/>
+          <w:b/>
+          <w:bCs/>
+          <w:i/>
+          <w:iCs/>
+        </w:rPr>
+        <w:t xml:space="preserve"> </w:t>
+      </w:r>
     </w:p>
     <w:p>
       <w:pPr>
         <w:spacing w:line="240" w:lineRule="auto"/>
         <w:rPr>
           <w:rFonts w:asciiTheme="majorHAnsi" w:eastAsia="STIX Two Text" w:hAnsiTheme="majorHAnsi" w:cstheme="majorHAnsi"/>
-        </w:rPr>
-      </w:pPr>
-      <w:r>
-        <w:rPr>
-          <w:rFonts w:asciiTheme="majorHAnsi" w:eastAsia="STIX Two Text" w:hAnsiTheme="majorHAnsi" w:cstheme="majorHAnsi"/>
-        </w:rPr>
-        <w:t>Module studied, grade (1st, 2:1)</w:t>
-      </w:r>
-    </w:p>
-    <w:p>
-      <w:pPr>
-        <w:spacing w:line="240" w:lineRule="auto"/>
-        <w:rPr>
-          <w:rFonts w:asciiTheme="majorHAnsi" w:eastAsia="STIX Two Text" w:hAnsiTheme="majorHAnsi" w:cstheme="majorHAnsi"/>
-          <w:b/>
-          <w:bCs/>
+          <w:b/>
+          <w:bCs/>
+          <w:i/>
+          <w:iCs/>
+          <w:sz w:val="6"/>
+          <w:szCs w:val="6"/>
+        </w:rPr>
+      </w:pPr>
+    </w:p>
+    <w:p>
+      <w:pPr>
+        <w:numPr>
+          <w:ilvl w:val="0"/>
+          <w:numId w:val="5"/>
+        </w:numPr>
+        <w:spacing w:after="60" w:line="240" w:lineRule="auto"/>
+        <w:ind w:left="641" w:hanging="357"/>
+        <w:mirrorIndents/>
+        <w:rPr>
+          <w:rFonts w:asciiTheme="majorHAnsi" w:eastAsia="STIX Two Text" w:hAnsiTheme="majorHAnsi" w:cstheme="majorHAnsi"/>
+          <w:i/>
+          <w:iCs/>
+        </w:rPr>
+      </w:pPr>
+      <w:r>
+        <w:rPr>
+          <w:rFonts w:asciiTheme="majorHAnsi" w:eastAsia="STIX Two Text" w:hAnsiTheme="majorHAnsi" w:cstheme="majorHAnsi"/>
+        </w:rPr>
+        <w:t xml:space="preserve">Format for the bullet points: </w:t>
+      </w:r>
+      <w:r>
+        <w:rPr>
+          <w:rFonts w:asciiTheme="majorHAnsi" w:eastAsia="STIX Two Text" w:hAnsiTheme="majorHAnsi" w:cstheme="majorHAnsi"/>
+          <w:b/>
+          <w:bCs/>
+        </w:rPr>
+        <w:t>Action verb + Task or Project + Metrics or Result.</w:t>
+      </w:r>
+      <w:r>
+        <w:rPr>
+          <w:rFonts w:asciiTheme="majorHAnsi" w:eastAsia="STIX Two Text" w:hAnsiTheme="majorHAnsi" w:cstheme="majorHAnsi"/>
+        </w:rPr>
+        <w:t xml:space="preserve"> Example: Created a new training and accountability program that increased productivity from #10 to #3 in the region in less than </w:t>
+      </w:r>
+      <w:proofErr w:type="gramStart"/>
+      <w:r>
+        <w:rPr>
+          <w:rFonts w:asciiTheme="majorHAnsi" w:eastAsia="STIX Two Text" w:hAnsiTheme="majorHAnsi" w:cstheme="majorHAnsi"/>
+        </w:rPr>
+        <w:t>2 year</w:t>
+      </w:r>
+      <w:proofErr w:type="gramEnd"/>
+      <w:r>
+        <w:rPr>
+          <w:rFonts w:asciiTheme="majorHAnsi" w:eastAsia="STIX Two Text" w:hAnsiTheme="majorHAnsi" w:cstheme="majorHAnsi"/>
+        </w:rPr>
+        <w:t xml:space="preserve"> period</w:t>
+      </w:r>
+    </w:p>
+    <w:p>
+      <w:pPr>
+        <w:numPr>
+          <w:ilvl w:val="0"/>
+          <w:numId w:val="5"/>
+        </w:numPr>
+        <w:spacing w:after="60" w:line="240" w:lineRule="auto"/>
+        <w:ind w:left="641" w:hanging="357"/>
+        <w:mirrorIndents/>
+        <w:rPr>
+          <w:rFonts w:asciiTheme="majorHAnsi" w:eastAsia="STIX Two Text" w:hAnsiTheme="majorHAnsi" w:cstheme="majorHAnsi"/>
+        </w:rPr>
+      </w:pPr>
+      <w:r>
+        <w:rPr>
+          <w:rFonts w:asciiTheme="majorHAnsi" w:eastAsia="STIX Two Text" w:hAnsiTheme="majorHAnsi" w:cstheme="majorHAnsi"/>
+        </w:rPr>
+        <w:t xml:space="preserve">Add around </w:t>
+      </w:r>
+      <w:r>
+        <w:rPr>
+          <w:rFonts w:asciiTheme="majorHAnsi" w:eastAsia="STIX Two Text" w:hAnsiTheme="majorHAnsi" w:cstheme="majorHAnsi"/>
+        </w:rPr>
+        <w:t>2</w:t>
+      </w:r>
+      <w:r>
+        <w:rPr>
+          <w:rFonts w:asciiTheme="majorHAnsi" w:eastAsia="STIX Two Text" w:hAnsiTheme="majorHAnsi" w:cstheme="majorHAnsi"/>
+        </w:rPr>
+        <w:t xml:space="preserve"> bullet points per project</w:t>
+      </w:r>
+    </w:p>
+    <w:p>
+      <w:pPr>
+        <w:spacing w:after="60" w:line="240" w:lineRule="auto"/>
+        <w:ind w:right="851"/>
+        <w:rPr>
+          <w:rFonts w:asciiTheme="majorHAnsi" w:eastAsia="STIX Two Text" w:hAnsiTheme="majorHAnsi" w:cstheme="majorHAnsi"/>
         </w:rPr>
       </w:pPr>
     </w:p>
@@ -1836,9 +1756,8 @@
           <w:sz w:val="24"/>
           <w:szCs w:val="24"/>
         </w:rPr>
-        <w:t xml:space="preserve">ADDITIONAL SKILLS                                                                                                                                                    </w:t>
-      </w:r>
-      <w:proofErr w:type="gramStart"/>
+        <w:t xml:space="preserve">EDUCATION </w:t>
+      </w:r>
       <w:r>
         <w:rPr>
           <w:rFonts w:asciiTheme="majorHAnsi" w:eastAsia="STIX Two Text" w:hAnsiTheme="majorHAnsi" w:cstheme="majorHAnsi"/>
@@ -1847,51 +1766,112 @@
           <w:sz w:val="24"/>
           <w:szCs w:val="24"/>
         </w:rPr>
-        <w:t xml:space="preserve">  </w:t>
-      </w:r>
-      <w:r>
-        <w:rPr>
-          <w:rFonts w:asciiTheme="majorHAnsi" w:eastAsia="STIX Two Text" w:hAnsiTheme="majorHAnsi" w:cstheme="majorHAnsi"/>
-          <w:b/>
-          <w:bCs/>
-          <w:color w:val="FFFFFF"/>
+        <w:t>&amp; CERTIFICATIONS</w:t>
+      </w:r>
+    </w:p>
+    <w:p>
+      <w:pPr>
+        <w:spacing w:line="240" w:lineRule="auto"/>
+        <w:rPr>
+          <w:rFonts w:asciiTheme="majorHAnsi" w:eastAsia="STIX Two Text" w:hAnsiTheme="majorHAnsi" w:cstheme="majorHAnsi"/>
+          <w:b/>
+          <w:bCs/>
+        </w:rPr>
+      </w:pPr>
+      <w:r>
+        <w:rPr>
+          <w:rFonts w:asciiTheme="majorHAnsi" w:eastAsia="STIX Two Text" w:hAnsiTheme="majorHAnsi" w:cstheme="majorHAnsi"/>
+          <w:b/>
+          <w:bCs/>
+        </w:rPr>
+        <w:t xml:space="preserve">UNIVERSITY (OR LAST EDUCATION </w:t>
+      </w:r>
+      <w:proofErr w:type="gramStart"/>
+      <w:r>
+        <w:rPr>
+          <w:rFonts w:asciiTheme="majorHAnsi" w:eastAsia="STIX Two Text" w:hAnsiTheme="majorHAnsi" w:cstheme="majorHAnsi"/>
+          <w:b/>
+          <w:bCs/>
+        </w:rPr>
+        <w:t xml:space="preserve">PLACE)   </w:t>
+      </w:r>
+      <w:proofErr w:type="gramEnd"/>
+      <w:r>
+        <w:rPr>
+          <w:rFonts w:asciiTheme="majorHAnsi" w:eastAsia="STIX Two Text" w:hAnsiTheme="majorHAnsi" w:cstheme="majorHAnsi"/>
+          <w:b/>
+          <w:bCs/>
+        </w:rPr>
+        <w:t xml:space="preserve">                                                                          </w:t>
+      </w:r>
+      <w:r>
+        <w:rPr>
+          <w:rFonts w:asciiTheme="majorHAnsi" w:eastAsia="STIX Two Text" w:hAnsiTheme="majorHAnsi" w:cstheme="majorHAnsi"/>
+          <w:b/>
+          <w:bCs/>
+        </w:rPr>
+        <w:t xml:space="preserve">                       </w:t>
+      </w:r>
+      <w:r>
+        <w:rPr>
+          <w:rFonts w:asciiTheme="majorHAnsi" w:eastAsia="STIX Two Text" w:hAnsiTheme="majorHAnsi" w:cstheme="majorHAnsi"/>
+          <w:i/>
+          <w:iCs/>
+        </w:rPr>
+        <w:t>Month year–Month, year</w:t>
+      </w:r>
+    </w:p>
+    <w:p>
+      <w:pPr>
+        <w:spacing w:line="240" w:lineRule="auto"/>
+        <w:rPr>
+          <w:rFonts w:asciiTheme="majorHAnsi" w:eastAsia="STIX Two Text" w:hAnsiTheme="majorHAnsi" w:cstheme="majorHAnsi"/>
+        </w:rPr>
+      </w:pPr>
+      <w:r>
+        <w:rPr>
+          <w:rFonts w:asciiTheme="majorHAnsi" w:eastAsia="STIX Two Text" w:hAnsiTheme="majorHAnsi" w:cstheme="majorHAnsi"/>
+        </w:rPr>
+        <w:t>Module studied, grade (1st, 2:1)</w:t>
+      </w:r>
+    </w:p>
+    <w:p>
+      <w:pPr>
+        <w:spacing w:line="240" w:lineRule="auto"/>
+        <w:rPr>
+          <w:rFonts w:asciiTheme="majorHAnsi" w:eastAsia="STIX Two Text" w:hAnsiTheme="majorHAnsi" w:cstheme="majorHAnsi"/>
+          <w:b/>
+          <w:bCs/>
+        </w:rPr>
+      </w:pPr>
+    </w:p>
+    <w:p>
+      <w:pPr>
+        <w:pBdr>
+          <w:bottom w:val="single" w:sz="6" w:space="1" w:color="auto"/>
+        </w:pBdr>
+        <w:tabs>
+          <w:tab w:val="left" w:pos="3008"/>
+        </w:tabs>
+        <w:spacing w:line="240" w:lineRule="auto"/>
+        <w:rPr>
+          <w:rFonts w:asciiTheme="majorHAnsi" w:eastAsia="STIX Two Text" w:hAnsiTheme="majorHAnsi" w:cstheme="majorHAnsi"/>
+          <w:b/>
+          <w:bCs/>
           <w:sz w:val="24"/>
           <w:szCs w:val="24"/>
         </w:rPr>
-        <w:t>.</w:t>
-      </w:r>
-      <w:proofErr w:type="gramEnd"/>
-      <w:r>
-        <w:rPr>
-          <w:rFonts w:asciiTheme="majorHAnsi" w:eastAsia="STIX Two Text" w:hAnsiTheme="majorHAnsi" w:cstheme="majorHAnsi"/>
-          <w:b/>
-          <w:bCs/>
-          <w:color w:val="FFFFFF"/>
+      </w:pPr>
+      <w:r>
+        <w:rPr>
+          <w:rFonts w:asciiTheme="majorHAnsi" w:eastAsia="STIX Two Text" w:hAnsiTheme="majorHAnsi" w:cstheme="majorHAnsi"/>
+          <w:b/>
+          <w:bCs/>
           <w:sz w:val="24"/>
           <w:szCs w:val="24"/>
         </w:rPr>
-        <w:t xml:space="preserve"> </w:t>
-      </w:r>
-      <w:r>
-        <w:rPr>
-          <w:rFonts w:asciiTheme="majorHAnsi" w:eastAsia="STIX Two Text" w:hAnsiTheme="majorHAnsi" w:cstheme="majorHAnsi"/>
-          <w:b/>
-          <w:bCs/>
-          <w:sz w:val="24"/>
-          <w:szCs w:val="24"/>
-        </w:rPr>
-        <w:t xml:space="preserve">    </w:t>
-      </w:r>
-    </w:p>
-    <w:p>
-      <w:pPr>
-        <w:spacing w:line="240" w:lineRule="auto"/>
-        <w:rPr>
-          <w:rFonts w:asciiTheme="majorHAnsi" w:eastAsia="STIX Two Text" w:hAnsiTheme="majorHAnsi" w:cstheme="majorHAnsi"/>
-          <w:sz w:val="4"/>
-          <w:szCs w:val="4"/>
-        </w:rPr>
-      </w:pPr>
+        <w:t>ADDITIONAL SKILLS</w:t>
+      </w:r>
     </w:p>
     <w:p>
       <w:pPr>
@@ -1914,7 +1894,7 @@
     <w:sectPr>
       <w:type w:val="continuous"/>
       <w:pgSz w:w="12240" w:h="15840"/>
-      <w:pgMar w:top="720" w:right="600" w:bottom="720" w:left="576" w:header="144" w:footer="288" w:gutter="0"/>
+      <w:pgMar w:top="720" w:right="567" w:bottom="720" w:left="567" w:header="142" w:footer="289" w:gutter="0"/>
       <w:cols w:space="720"/>
     </w:sectPr>
   </w:body>
@@ -2604,7 +2584,7 @@
   <w:abstractNum w:abstractNumId="5" w15:restartNumberingAfterBreak="0">
     <w:nsid w:val="3CA379E6"/>
     <w:multiLevelType w:val="multilevel"/>
-    <w:tmpl w:val="9C2A767A"/>
+    <w:tmpl w:val="2F846940"/>
     <w:lvl w:ilvl="0">
       <w:start w:val="1"/>
       <w:numFmt w:val="bullet"/>
@@ -4669,4 +4649,16 @@
   </a:objectDefaults>
   <a:extraClrSchemeLst/>
 </a:theme>
+</file>
+
+<file path=customXml/item1.xml><?xml version="1.0" encoding="utf-8"?>
+<b:Sources xmlns:b="http://schemas.openxmlformats.org/officeDocument/2006/bibliography" xmlns="http://schemas.openxmlformats.org/officeDocument/2006/bibliography" SelectedStyle="\APASixthEditionOfficeOnline.xsl" StyleName="APA" Version="6"/>
+</file>
+
+<file path=customXml/itemProps1.xml><?xml version="1.0" encoding="utf-8"?>
+<ds:datastoreItem xmlns:ds="http://schemas.openxmlformats.org/officeDocument/2006/customXml" ds:itemID="{49E4109A-AD26-43AF-A9B4-2BD87BE4AB06}">
+  <ds:schemaRefs>
+    <ds:schemaRef ds:uri="http://schemas.openxmlformats.org/officeDocument/2006/bibliography"/>
+  </ds:schemaRefs>
+</ds:datastoreItem>
 </file>
</xml_diff>

<commit_message>
Updated skill to two page resume
</commit_message>
<xml_diff>
--- a/templates/template_0.docx
+++ b/templates/template_0.docx
@@ -198,7 +198,7 @@
           <w:footerReference w:type="first" r:id="rId10"/>
           <w:type w:val="continuous"/>
           <w:pgSz w:w="12240" w:h="15840"/>
-          <w:pgMar w:top="720" w:right="567" w:bottom="720" w:left="567" w:header="142" w:footer="289" w:gutter="0"/>
+          <w:pgMar w:top="856" w:right="856" w:bottom="856" w:left="856" w:header="142" w:footer="289" w:gutter="0"/>
           <w:cols w:space="720"/>
           <w:docGrid w:linePitch="299"/>
         </w:sectPr>
@@ -424,11 +424,11 @@
         <w:sectPr>
           <w:type w:val="continuous"/>
           <w:pgSz w:w="12240" w:h="15840"/>
-          <w:pgMar w:top="1009" w:right="567" w:bottom="1009" w:left="567" w:header="720" w:footer="720" w:gutter="0"/>
+          <w:pgMar w:top="856" w:right="856" w:bottom="856" w:left="856" w:header="720" w:footer="720" w:gutter="0"/>
           <w:cols w:num="3" w:space="720" w:equalWidth="0">
-            <w:col w:w="3393" w:space="720"/>
+            <w:col w:w="3104" w:space="720"/>
             <w:col w:w="2880" w:space="720"/>
-            <w:col w:w="3393" w:space="0"/>
+            <w:col w:w="3104" w:space="0"/>
           </w:cols>
         </w:sectPr>
       </w:pPr>
@@ -486,17 +486,6 @@
         </w:rPr>
         <w:t xml:space="preserve"> </w:t>
       </w:r>
-    </w:p>
-    <w:p>
-      <w:pPr>
-        <w:spacing w:line="240" w:lineRule="auto"/>
-        <w:rPr>
-          <w:rFonts w:asciiTheme="majorHAnsi" w:eastAsia="STIX Two Text" w:hAnsiTheme="majorHAnsi" w:cstheme="majorHAnsi"/>
-          <w:b/>
-          <w:bCs/>
-          <w:highlight w:val="white"/>
-        </w:rPr>
-      </w:pPr>
     </w:p>
     <w:p>
       <w:pPr>
@@ -1014,13 +1003,7 @@
         <w:rPr>
           <w:rFonts w:asciiTheme="majorHAnsi" w:eastAsia="STIX Two Text" w:hAnsiTheme="majorHAnsi" w:cstheme="majorHAnsi"/>
         </w:rPr>
-        <w:t xml:space="preserve">                 </w:t>
-      </w:r>
-      <w:r>
-        <w:rPr>
-          <w:rFonts w:asciiTheme="majorHAnsi" w:eastAsia="STIX Two Text" w:hAnsiTheme="majorHAnsi" w:cstheme="majorHAnsi"/>
-        </w:rPr>
-        <w:t xml:space="preserve"> </w:t>
+        <w:t xml:space="preserve">                  </w:t>
       </w:r>
       <w:r>
         <w:rPr>
@@ -1662,6 +1645,7 @@
         <w:rPr>
           <w:rFonts w:asciiTheme="majorHAnsi" w:eastAsia="STIX Two Text" w:hAnsiTheme="majorHAnsi" w:cstheme="majorHAnsi"/>
         </w:rPr>
+        <w:lastRenderedPageBreak/>
         <w:t xml:space="preserve">Format for the bullet points: </w:t>
       </w:r>
       <w:r>
@@ -1894,7 +1878,7 @@
     <w:sectPr>
       <w:type w:val="continuous"/>
       <w:pgSz w:w="12240" w:h="15840"/>
-      <w:pgMar w:top="720" w:right="567" w:bottom="720" w:left="567" w:header="142" w:footer="289" w:gutter="0"/>
+      <w:pgMar w:top="856" w:right="856" w:bottom="856" w:left="856" w:header="142" w:footer="289" w:gutter="0"/>
       <w:cols w:space="720"/>
     </w:sectPr>
   </w:body>

</xml_diff>